<commit_message>
feat: materialise the fixed train/test split (Tasks 7, 8, 15)
Persist the deterministic student-level 20% split: data/splits/test_student_ids.csv
(committed, 5,756 students) + reports/tables/split_report.csv + per-dataset
train/test parquet (--materialise, git-ignored). Adds load_checkpoint_split() for
the modelling phase. Identical across master + 6 checkpoints; 0 student overlap.

Co-Authored-By: Claude Opus 4.8 (1M context) <noreply@anthropic.com>
</commit_message>
<xml_diff>
--- a/docs/01_data_specification/Data_Specification_EN.docx
+++ b/docs/01_data_specification/Data_Specification_EN.docx
@@ -878,7 +878,7 @@
         <w:t xml:space="preserve">4.1 Demographic Features</w:t>
       </w:r>
       <w:r>
-        <w:br/>
+        <w:t xml:space="preserve"> </w:t>
       </w:r>
       <w:r>
         <w:t xml:space="preserve">Sourced from</w:t>
@@ -923,7 +923,7 @@
         <w:t xml:space="preserve">4.2 Engagement (VLE) Features</w:t>
       </w:r>
       <w:r>
-        <w:br/>
+        <w:t xml:space="preserve"> </w:t>
       </w:r>
       <w:r>
         <w:t xml:space="preserve">Sourced from</w:t>
@@ -1049,7 +1049,7 @@
         <w:t xml:space="preserve">4.3 Performance (Assessment) Features</w:t>
       </w:r>
       <w:r>
-        <w:br/>
+        <w:t xml:space="preserve"> </w:t>
       </w:r>
       <w:r>
         <w:t xml:space="preserve">Sourced from</w:t>
@@ -1127,7 +1127,7 @@
         <w:t xml:space="preserve">4.4 Target Variable</w:t>
       </w:r>
       <w:r>
-        <w:br/>
+        <w:t xml:space="preserve"> </w:t>
       </w:r>
       <w:r>
         <w:t xml:space="preserve">The binary label is derived from</w:t>

</xml_diff>